<commit_message>
V.1.3 & add online report
</commit_message>
<xml_diff>
--- a/templates/รายงานกระบวนพิจารณาออนใลน์.docx
+++ b/templates/รายงานกระบวนพิจารณาออนใลน์.docx
@@ -1745,35 +1745,16 @@
     <w:p>
       <w:pPr>
         <w:spacing w:line="18pt" w:lineRule="auto"/>
+        <w:ind w:firstLine="72pt"/>
         <w:jc w:val="thaiDistribute"/>
         <w:rPr>
-          <w:rFonts w:ascii="TH SarabunIT๙" w:hAnsi="TH SarabunIT๙" w:cs="TH SarabunIT๙" w:hint="cs"/>
+          <w:rFonts w:ascii="TH SarabunIT๙" w:hAnsi="TH SarabunIT๙" w:cs="TH SarabunIT๙"/>
           <w:spacing w:val="-10"/>
           <w:sz w:val="34"/>
           <w:szCs w:val="34"/>
           <w:cs/>
         </w:rPr>
       </w:pPr>
-      <w:r>
-        <w:rPr>
-          <w:rFonts w:ascii="TH SarabunIT๙" w:hAnsi="TH SarabunIT๙" w:cs="TH SarabunIT๙"/>
-          <w:spacing w:val="-10"/>
-          <w:sz w:val="34"/>
-          <w:szCs w:val="34"/>
-          <w:cs/>
-        </w:rPr>
-        <w:tab/>
-      </w:r>
-      <w:r>
-        <w:rPr>
-          <w:rFonts w:ascii="TH SarabunIT๙" w:hAnsi="TH SarabunIT๙" w:cs="TH SarabunIT๙"/>
-          <w:spacing w:val="-10"/>
-          <w:sz w:val="34"/>
-          <w:szCs w:val="34"/>
-          <w:cs/>
-        </w:rPr>
-        <w:tab/>
-      </w:r>
       <w:r>
         <w:rPr>
           <w:rFonts w:ascii="TH SarabunIT๙" w:hAnsi="TH SarabunIT๙" w:cs="TH SarabunIT๙"/>
@@ -1936,17 +1917,6 @@
     <w:p>
       <w:pPr>
         <w:spacing w:line="18pt" w:lineRule="auto"/>
-        <w:jc w:val="thaiDistribute"/>
-        <w:rPr>
-          <w:rFonts w:ascii="TH SarabunIT๙" w:hAnsi="TH SarabunIT๙" w:cs="TH SarabunIT๙"/>
-          <w:sz w:val="34"/>
-          <w:szCs w:val="34"/>
-        </w:rPr>
-      </w:pPr>
-    </w:p>
-    <w:p>
-      <w:pPr>
-        <w:spacing w:line="18pt" w:lineRule="auto"/>
         <w:jc w:val="end"/>
         <w:rPr>
           <w:rFonts w:ascii="TH SarabunIT๙" w:hAnsi="TH SarabunIT๙" w:cs="TH SarabunIT๙"/>
@@ -1992,7 +1962,7 @@
         <w:ind w:firstLine="36pt"/>
         <w:jc w:val="thaiDistribute"/>
         <w:rPr>
-          <w:rFonts w:ascii="TH SarabunIT๙" w:hAnsi="TH SarabunIT๙" w:cs="TH SarabunIT๙" w:hint="cs"/>
+          <w:rFonts w:ascii="TH SarabunIT๙" w:hAnsi="TH SarabunIT๙" w:cs="TH SarabunIT๙"/>
           <w:sz w:val="34"/>
           <w:szCs w:val="34"/>
         </w:rPr>

</xml_diff>